<commit_message>
Rework Delos bullets in CV: FDE client project and WhatsApp integration
Co-Authored-By: Claude Fable 5.1 <noreply@anthropic.com>
Claude-Session: https://claude.ai/code/session_01FkUVpnmeCRPZ4XVFEJqiKk
</commit_message>
<xml_diff>
--- a/cv/Arsene_Le_Moigne_CV_EN_Legal_Engineer.docx
+++ b/cv/Arsene_Le_Moigne_CV_EN_Legal_Engineer.docx
@@ -31,7 +31,7 @@
         </w:rPr>
         <w:t xml:space="preserve">Mobile: +420 702 080 468 | </w:t>
       </w:r>
-      <w:hyperlink w:history="1" r:id="rIdimmcpotgyyudd21btqcfn">
+      <w:hyperlink w:history="1" r:id="rIdt6v2d1in8-cespa52dbv-">
         <w:r>
           <w:rPr>
             <w:rFonts w:ascii="Times New Roman" w:cs="Times New Roman" w:eastAsia="Times New Roman" w:hAnsi="Times New Roman"/>
@@ -159,43 +159,43 @@
           <w:sz w:val="22"/>
           <w:szCs w:val="22"/>
         </w:rPr>
-        <w:t xml:space="preserve">Design and deployment of AI agents for legal use cases (contract review, research, drafting); MCP integrations and API-based tooling</w:t>
-      </w:r>
-    </w:p>
-    <w:p>
-      <w:pPr>
-        <w:pStyle w:val="ListParagraph"/>
-        <w:numPr>
-          <w:ilvl w:val="0"/>
-          <w:numId w:val="2"/>
-        </w:numPr>
-        <w:spacing w:after="20" w:before="0"/>
-      </w:pPr>
-      <w:r>
-        <w:rPr>
-          <w:rFonts w:ascii="Times New Roman" w:cs="Times New Roman" w:eastAsia="Times New Roman" w:hAnsi="Times New Roman"/>
-          <w:sz w:val="22"/>
-          <w:szCs w:val="22"/>
-        </w:rPr>
-        <w:t xml:space="preserve">Built the WhatsApp integration of the Delos agent (WhatsApp Business API), letting clients query the agent directly by message</w:t>
-      </w:r>
-    </w:p>
-    <w:p>
-      <w:pPr>
-        <w:pStyle w:val="ListParagraph"/>
-        <w:numPr>
-          <w:ilvl w:val="0"/>
-          <w:numId w:val="2"/>
-        </w:numPr>
-        <w:spacing w:after="20" w:before="0"/>
-      </w:pPr>
-      <w:r>
-        <w:rPr>
-          <w:rFonts w:ascii="Times New Roman" w:cs="Times New Roman" w:eastAsia="Times New Roman" w:hAnsi="Times New Roman"/>
-          <w:sz w:val="22"/>
-          <w:szCs w:val="22"/>
-        </w:rPr>
-        <w:t xml:space="preserve">Forward deployed: product rollout at client sites, workflow configuration, answer evaluation and feedback loop to the product team</w:t>
+        <w:t xml:space="preserve">Forward deployed engineer: designed and shipped AI agents for a client covering compliance, contract analysis, legal research, IP analysis and counterfeit tracking</w:t>
+      </w:r>
+    </w:p>
+    <w:p>
+      <w:pPr>
+        <w:pStyle w:val="ListParagraph"/>
+        <w:numPr>
+          <w:ilvl w:val="0"/>
+          <w:numId w:val="2"/>
+        </w:numPr>
+        <w:spacing w:after="20" w:before="0"/>
+      </w:pPr>
+      <w:r>
+        <w:rPr>
+          <w:rFonts w:ascii="Times New Roman" w:cs="Times New Roman" w:eastAsia="Times New Roman" w:hAnsi="Times New Roman"/>
+          <w:sz w:val="22"/>
+          <w:szCs w:val="22"/>
+        </w:rPr>
+        <w:t xml:space="preserve">WhatsApp integration of the Delos agent (WhatsApp Business API) used in an ads campaign I co-designed: coded, tested, evaluated and pushed to production on my own</w:t>
+      </w:r>
+    </w:p>
+    <w:p>
+      <w:pPr>
+        <w:pStyle w:val="ListParagraph"/>
+        <w:numPr>
+          <w:ilvl w:val="0"/>
+          <w:numId w:val="2"/>
+        </w:numPr>
+        <w:spacing w:after="20" w:before="0"/>
+      </w:pPr>
+      <w:r>
+        <w:rPr>
+          <w:rFonts w:ascii="Times New Roman" w:cs="Times New Roman" w:eastAsia="Times New Roman" w:hAnsi="Times New Roman"/>
+          <w:sz w:val="22"/>
+          <w:szCs w:val="22"/>
+        </w:rPr>
+        <w:t xml:space="preserve">MCP integrations and API-based tooling, workflow configuration and answer evaluation; feedback loop to the product team</w:t>
       </w:r>
     </w:p>
     <w:p>

</xml_diff>

<commit_message>
Rewrite CV wording in FR and EN, fix thesis title
Co-Authored-By: Claude Opus 5.5 <noreply@anthropic.com>
Claude-Session: https://claude.ai/code/session_01FkUVpnmeCRPZ4XVFEJqiKk
</commit_message>
<xml_diff>
--- a/cv/Arsene_Le_Moigne_CV_EN_Legal_Engineer.docx
+++ b/cv/Arsene_Le_Moigne_CV_EN_Legal_Engineer.docx
@@ -31,7 +31,7 @@
         </w:rPr>
         <w:t xml:space="preserve">Mobile: +420 702 080 468 | </w:t>
       </w:r>
-      <w:hyperlink w:history="1" r:id="rIdt6v2d1in8-cespa52dbv-">
+      <w:hyperlink w:history="1" r:id="rIdlnxuqguvlfqes9sg01o3p">
         <w:r>
           <w:rPr>
             <w:rFonts w:ascii="Times New Roman" w:cs="Times New Roman" w:eastAsia="Times New Roman" w:hAnsi="Times New Roman"/>
@@ -62,7 +62,7 @@
           <w:sz w:val="22"/>
           <w:szCs w:val="22"/>
         </w:rPr>
-        <w:t xml:space="preserve">Head of Legal &amp; Legal Engineer at Delos Intelligence (sovereign AI, Paris) and trainee lawyer at the Paris Bar School (EFB), currently in the work-placement phase. HEC Paris and Paris 1 Sorbonne graduate (business law). I design and deploy AI agents for legal teams and I am applying for a Legal Engineer position at Legora in Paris.</w:t>
+        <w:t xml:space="preserve">Legal Engineer with a business-law background. At Delos Intelligence I design, code and deploy AI agents for legal teams while completing my bar training at the Paris Bar School (EFB). Graduate of HEC Paris and Paris 1 Sorbonne in business law. Applying for the Legal Engineer role at Legora in Paris.</w:t>
       </w:r>
     </w:p>
     <w:p>
@@ -159,61 +159,61 @@
           <w:sz w:val="22"/>
           <w:szCs w:val="22"/>
         </w:rPr>
-        <w:t xml:space="preserve">Forward deployed engineer: designed and shipped AI agents for a client covering compliance, contract analysis, legal research, IP analysis and counterfeit tracking</w:t>
-      </w:r>
-    </w:p>
-    <w:p>
-      <w:pPr>
-        <w:pStyle w:val="ListParagraph"/>
-        <w:numPr>
-          <w:ilvl w:val="0"/>
-          <w:numId w:val="2"/>
-        </w:numPr>
-        <w:spacing w:after="20" w:before="0"/>
-      </w:pPr>
-      <w:r>
-        <w:rPr>
-          <w:rFonts w:ascii="Times New Roman" w:cs="Times New Roman" w:eastAsia="Times New Roman" w:hAnsi="Times New Roman"/>
-          <w:sz w:val="22"/>
-          <w:szCs w:val="22"/>
-        </w:rPr>
-        <w:t xml:space="preserve">WhatsApp integration of the Delos agent (WhatsApp Business API) used in an ads campaign I co-designed: coded, tested, evaluated and pushed to production on my own</w:t>
-      </w:r>
-    </w:p>
-    <w:p>
-      <w:pPr>
-        <w:pStyle w:val="ListParagraph"/>
-        <w:numPr>
-          <w:ilvl w:val="0"/>
-          <w:numId w:val="2"/>
-        </w:numPr>
-        <w:spacing w:after="20" w:before="0"/>
-      </w:pPr>
-      <w:r>
-        <w:rPr>
-          <w:rFonts w:ascii="Times New Roman" w:cs="Times New Roman" w:eastAsia="Times New Roman" w:hAnsi="Times New Roman"/>
-          <w:sz w:val="22"/>
-          <w:szCs w:val="22"/>
-        </w:rPr>
-        <w:t xml:space="preserve">MCP integrations and API-based tooling, workflow configuration and answer evaluation; feedback loop to the product team</w:t>
-      </w:r>
-    </w:p>
-    <w:p>
-      <w:pPr>
-        <w:pStyle w:val="ListParagraph"/>
-        <w:numPr>
-          <w:ilvl w:val="0"/>
-          <w:numId w:val="2"/>
-        </w:numPr>
-        <w:spacing w:after="20" w:before="0"/>
-      </w:pPr>
-      <w:r>
-        <w:rPr>
-          <w:rFonts w:ascii="Times New Roman" w:cs="Times New Roman" w:eastAsia="Times New Roman" w:hAnsi="Times New Roman"/>
-          <w:sz w:val="22"/>
-          <w:szCs w:val="22"/>
-        </w:rPr>
-        <w:t xml:space="preserve">Head of Legal: customer contracts, terms of service, DPAs, GDPR and EU AI Act compliance; sales support (demos, tenders)</w:t>
+        <w:t xml:space="preserve">Forward deployed engineer for a client: built and shipped AI agents for compliance, contract analysis, legal research, IP analysis and counterfeit tracking</w:t>
+      </w:r>
+    </w:p>
+    <w:p>
+      <w:pPr>
+        <w:pStyle w:val="ListParagraph"/>
+        <w:numPr>
+          <w:ilvl w:val="0"/>
+          <w:numId w:val="2"/>
+        </w:numPr>
+        <w:spacing w:after="20" w:before="0"/>
+      </w:pPr>
+      <w:r>
+        <w:rPr>
+          <w:rFonts w:ascii="Times New Roman" w:cs="Times New Roman" w:eastAsia="Times New Roman" w:hAnsi="Times New Roman"/>
+          <w:sz w:val="22"/>
+          <w:szCs w:val="22"/>
+        </w:rPr>
+        <w:t xml:space="preserve">Owned the agent's WhatsApp integration end to end (code, testing, evaluation, production release); it powered an ads campaign I co-designed</w:t>
+      </w:r>
+    </w:p>
+    <w:p>
+      <w:pPr>
+        <w:pStyle w:val="ListParagraph"/>
+        <w:numPr>
+          <w:ilvl w:val="0"/>
+          <w:numId w:val="2"/>
+        </w:numPr>
+        <w:spacing w:after="20" w:before="0"/>
+      </w:pPr>
+      <w:r>
+        <w:rPr>
+          <w:rFonts w:ascii="Times New Roman" w:cs="Times New Roman" w:eastAsia="Times New Roman" w:hAnsi="Times New Roman"/>
+          <w:sz w:val="22"/>
+          <w:szCs w:val="22"/>
+        </w:rPr>
+        <w:t xml:space="preserve">Run the company's legal function: customer contracts, terms, DPAs, GDPR and EU AI Act compliance</w:t>
+      </w:r>
+    </w:p>
+    <w:p>
+      <w:pPr>
+        <w:pStyle w:val="ListParagraph"/>
+        <w:numPr>
+          <w:ilvl w:val="0"/>
+          <w:numId w:val="2"/>
+        </w:numPr>
+        <w:spacing w:after="20" w:before="0"/>
+      </w:pPr>
+      <w:r>
+        <w:rPr>
+          <w:rFonts w:ascii="Times New Roman" w:cs="Times New Roman" w:eastAsia="Times New Roman" w:hAnsi="Times New Roman"/>
+          <w:sz w:val="22"/>
+          <w:szCs w:val="22"/>
+        </w:rPr>
+        <w:t xml:space="preserve">Support sales with demos and tender responses, and feed client insights back to the product team</w:t>
       </w:r>
     </w:p>
     <w:p>
@@ -265,7 +265,7 @@
           <w:sz w:val="22"/>
           <w:szCs w:val="22"/>
         </w:rPr>
-        <w:t xml:space="preserve">Tech scale-up specialised in the electrification of heavy-duty mobility</w:t>
+        <w:t xml:space="preserve">Tech scale-up electrifying heavy-duty mobility</w:t>
       </w:r>
       <w:r>
         <w:rPr>
@@ -291,43 +291,43 @@
           <w:sz w:val="22"/>
           <w:szCs w:val="22"/>
         </w:rPr>
-        <w:t xml:space="preserve">Built a custom prospecting dataset from the German MaStR energy registry: filtered, enriched and scored prospects on PV park size, kWh and other metrics</w:t>
-      </w:r>
-    </w:p>
-    <w:p>
-      <w:pPr>
-        <w:pStyle w:val="ListParagraph"/>
-        <w:numPr>
-          <w:ilvl w:val="0"/>
-          <w:numId w:val="2"/>
-        </w:numPr>
-        <w:spacing w:after="20" w:before="0"/>
-      </w:pPr>
-      <w:r>
-        <w:rPr>
-          <w:rFonts w:ascii="Times New Roman" w:cs="Times New Roman" w:eastAsia="Times New Roman" w:hAnsi="Times New Roman"/>
-          <w:sz w:val="22"/>
-          <w:szCs w:val="22"/>
-        </w:rPr>
-        <w:t xml:space="preserve">Designed and launched the outbound B2B email campaign from scratch: 10% reply rate, integrated into the CRM via Clay, Apollo and other MCP servers</w:t>
-      </w:r>
-    </w:p>
-    <w:p>
-      <w:pPr>
-        <w:pStyle w:val="ListParagraph"/>
-        <w:numPr>
-          <w:ilvl w:val="0"/>
-          <w:numId w:val="2"/>
-        </w:numPr>
-        <w:spacing w:after="20" w:before="0"/>
-      </w:pPr>
-      <w:r>
-        <w:rPr>
-          <w:rFonts w:ascii="Times New Roman" w:cs="Times New Roman" w:eastAsia="Times New Roman" w:hAnsi="Times New Roman"/>
-          <w:sz w:val="22"/>
-          <w:szCs w:val="22"/>
-        </w:rPr>
-        <w:t xml:space="preserve">Built the full financial model used for investor relations</w:t>
+        <w:t xml:space="preserve">Built outbound B2B prospecting from scratch: 10% reply rate on email campaigns, synced to the CRM through Clay, Apollo and MCP</w:t>
+      </w:r>
+    </w:p>
+    <w:p>
+      <w:pPr>
+        <w:pStyle w:val="ListParagraph"/>
+        <w:numPr>
+          <w:ilvl w:val="0"/>
+          <w:numId w:val="2"/>
+        </w:numPr>
+        <w:spacing w:after="20" w:before="0"/>
+      </w:pPr>
+      <w:r>
+        <w:rPr>
+          <w:rFonts w:ascii="Times New Roman" w:cs="Times New Roman" w:eastAsia="Times New Roman" w:hAnsi="Times New Roman"/>
+          <w:sz w:val="22"/>
+          <w:szCs w:val="22"/>
+        </w:rPr>
+        <w:t xml:space="preserve">Assembled a prospect database from Germany's MaStR energy registry, scored on installed PV capacity, kWh output and other metrics</w:t>
+      </w:r>
+    </w:p>
+    <w:p>
+      <w:pPr>
+        <w:pStyle w:val="ListParagraph"/>
+        <w:numPr>
+          <w:ilvl w:val="0"/>
+          <w:numId w:val="2"/>
+        </w:numPr>
+        <w:spacing w:after="20" w:before="0"/>
+      </w:pPr>
+      <w:r>
+        <w:rPr>
+          <w:rFonts w:ascii="Times New Roman" w:cs="Times New Roman" w:eastAsia="Times New Roman" w:hAnsi="Times New Roman"/>
+          <w:sz w:val="22"/>
+          <w:szCs w:val="22"/>
+        </w:rPr>
+        <w:t xml:space="preserve">Built the full financial model for investor relations</w:t>
       </w:r>
     </w:p>
     <w:p>
@@ -405,7 +405,7 @@
           <w:sz w:val="22"/>
           <w:szCs w:val="22"/>
         </w:rPr>
-        <w:t xml:space="preserve">Customs-risk exposure analysis across 25+ brands, with a tool developed in Python</w:t>
+        <w:t xml:space="preserve">Mapped customs-risk exposure across 25+ brands with a Python tool I developed</w:t>
       </w:r>
     </w:p>
     <w:p>
@@ -457,7 +457,7 @@
           <w:sz w:val="22"/>
           <w:szCs w:val="22"/>
         </w:rPr>
-        <w:t xml:space="preserve">Czech law firm specialised in technology and digital</w:t>
+        <w:t xml:space="preserve">Czech law firm specialised in technology</w:t>
       </w:r>
       <w:r>
         <w:rPr>
@@ -483,25 +483,25 @@
           <w:sz w:val="22"/>
           <w:szCs w:val="22"/>
         </w:rPr>
-        <w:t xml:space="preserve">Review of pre-contractual documentation and share purchase agreements</w:t>
-      </w:r>
-    </w:p>
-    <w:p>
-      <w:pPr>
-        <w:pStyle w:val="ListParagraph"/>
-        <w:numPr>
-          <w:ilvl w:val="0"/>
-          <w:numId w:val="2"/>
-        </w:numPr>
-        <w:spacing w:after="20" w:before="0"/>
-      </w:pPr>
-      <w:r>
-        <w:rPr>
-          <w:rFonts w:ascii="Times New Roman" w:cs="Times New Roman" w:eastAsia="Times New Roman" w:hAnsi="Times New Roman"/>
-          <w:sz w:val="22"/>
-          <w:szCs w:val="22"/>
-        </w:rPr>
-        <w:t xml:space="preserve">Independently carried out a due diligence in Hamburg in an international litigation matter</w:t>
+        <w:t xml:space="preserve">Reviewed pre-contractual documentation and share purchase agreements</w:t>
+      </w:r>
+    </w:p>
+    <w:p>
+      <w:pPr>
+        <w:pStyle w:val="ListParagraph"/>
+        <w:numPr>
+          <w:ilvl w:val="0"/>
+          <w:numId w:val="2"/>
+        </w:numPr>
+        <w:spacing w:after="20" w:before="0"/>
+      </w:pPr>
+      <w:r>
+        <w:rPr>
+          <w:rFonts w:ascii="Times New Roman" w:cs="Times New Roman" w:eastAsia="Times New Roman" w:hAnsi="Times New Roman"/>
+          <w:sz w:val="22"/>
+          <w:szCs w:val="22"/>
+        </w:rPr>
+        <w:t xml:space="preserve">Led a due diligence in Hamburg on my own for an international litigation case</w:t>
       </w:r>
     </w:p>
     <w:p>
@@ -658,7 +658,7 @@
           <w:sz w:val="22"/>
           <w:szCs w:val="22"/>
         </w:rPr>
-        <w:t xml:space="preserve">Thesis: tax law put to the test of autonomous agents</w:t>
+        <w:t xml:space="preserve">Thesis: “The Commercial Lifecycle of Autonomous Agents”</w:t>
       </w:r>
     </w:p>
     <w:p>
@@ -736,7 +736,7 @@
           <w:sz w:val="22"/>
           <w:szCs w:val="22"/>
         </w:rPr>
-        <w:t xml:space="preserve">Exchange year at Università Bocconi (Finance and Accounting)</w:t>
+        <w:t xml:space="preserve">Exchange year at Università Bocconi (finance and accounting)</w:t>
       </w:r>
     </w:p>
     <w:p>
@@ -833,25 +833,25 @@
           <w:sz w:val="22"/>
           <w:szCs w:val="22"/>
         </w:rPr>
-        <w:t xml:space="preserve">2nd place at the European Defense Tech Hackathon in Prague (2025): designed and pitched an autonomous drone prototype to defence experts</w:t>
-      </w:r>
-    </w:p>
-    <w:p>
-      <w:pPr>
-        <w:pStyle w:val="ListParagraph"/>
-        <w:numPr>
-          <w:ilvl w:val="0"/>
-          <w:numId w:val="2"/>
-        </w:numPr>
-        <w:spacing w:after="20" w:before="0"/>
-      </w:pPr>
-      <w:r>
-        <w:rPr>
-          <w:rFonts w:ascii="Times New Roman" w:cs="Times New Roman" w:eastAsia="Times New Roman" w:hAnsi="Times New Roman"/>
-          <w:sz w:val="22"/>
-          <w:szCs w:val="22"/>
-        </w:rPr>
-        <w:t xml:space="preserve">Captain of the HEC rowing team, 5th place at the French University Championships (8+) in 2024. Czech national vice-champion in rowing (4x) in 2018</w:t>
+        <w:t xml:space="preserve">European Defense Tech Hackathon, Prague (2025): 2nd place with an autonomous drone prototype pitched to defence experts</w:t>
+      </w:r>
+    </w:p>
+    <w:p>
+      <w:pPr>
+        <w:pStyle w:val="ListParagraph"/>
+        <w:numPr>
+          <w:ilvl w:val="0"/>
+          <w:numId w:val="2"/>
+        </w:numPr>
+        <w:spacing w:after="20" w:before="0"/>
+      </w:pPr>
+      <w:r>
+        <w:rPr>
+          <w:rFonts w:ascii="Times New Roman" w:cs="Times New Roman" w:eastAsia="Times New Roman" w:hAnsi="Times New Roman"/>
+          <w:sz w:val="22"/>
+          <w:szCs w:val="22"/>
+        </w:rPr>
+        <w:t xml:space="preserve">Captain of the HEC rowing team: 5th at the French University Championships (eight, 2024). Czech national runner-up (quad, 2018)</w:t>
       </w:r>
     </w:p>
     <w:p>
@@ -888,43 +888,43 @@
           <w:sz w:val="22"/>
           <w:szCs w:val="22"/>
         </w:rPr>
-        <w:t xml:space="preserve">Trilingual: French, Czech, English | Basic: German and Italian</w:t>
-      </w:r>
-    </w:p>
-    <w:p>
-      <w:pPr>
-        <w:pStyle w:val="ListParagraph"/>
-        <w:numPr>
-          <w:ilvl w:val="0"/>
-          <w:numId w:val="2"/>
-        </w:numPr>
-        <w:spacing w:after="20" w:before="0"/>
-      </w:pPr>
-      <w:r>
-        <w:rPr>
-          <w:rFonts w:ascii="Times New Roman" w:cs="Times New Roman" w:eastAsia="Times New Roman" w:hAnsi="Times New Roman"/>
-          <w:sz w:val="22"/>
-          <w:szCs w:val="22"/>
-        </w:rPr>
-        <w:t xml:space="preserve">AI agent development: Claude / OpenAI APIs, MCP, WhatsApp Business API. Python (Harvard CS50), SQL (Google Data Analytics), TypeScript / Next.js / Supabase</w:t>
-      </w:r>
-    </w:p>
-    <w:p>
-      <w:pPr>
-        <w:pStyle w:val="ListParagraph"/>
-        <w:numPr>
-          <w:ilvl w:val="0"/>
-          <w:numId w:val="2"/>
-        </w:numPr>
-        <w:spacing w:after="20" w:before="0"/>
-      </w:pPr>
-      <w:r>
-        <w:rPr>
-          <w:rFonts w:ascii="Times New Roman" w:cs="Times New Roman" w:eastAsia="Times New Roman" w:hAnsi="Times New Roman"/>
-          <w:sz w:val="22"/>
-          <w:szCs w:val="22"/>
-        </w:rPr>
-        <w:t xml:space="preserve">Law: tech contracts, GDPR, EU AI Act, tax law, litigation and M&amp;A</w:t>
+        <w:t xml:space="preserve">Languages: French, Czech, English (fluent). German, Italian (basic)</w:t>
+      </w:r>
+    </w:p>
+    <w:p>
+      <w:pPr>
+        <w:pStyle w:val="ListParagraph"/>
+        <w:numPr>
+          <w:ilvl w:val="0"/>
+          <w:numId w:val="2"/>
+        </w:numPr>
+        <w:spacing w:after="20" w:before="0"/>
+      </w:pPr>
+      <w:r>
+        <w:rPr>
+          <w:rFonts w:ascii="Times New Roman" w:cs="Times New Roman" w:eastAsia="Times New Roman" w:hAnsi="Times New Roman"/>
+          <w:sz w:val="22"/>
+          <w:szCs w:val="22"/>
+        </w:rPr>
+        <w:t xml:space="preserve">Tech: Claude and OpenAI APIs, MCP, WhatsApp Business API, Python (Harvard CS50), SQL (Google Data Analytics), TypeScript, Next.js, Supabase</w:t>
+      </w:r>
+    </w:p>
+    <w:p>
+      <w:pPr>
+        <w:pStyle w:val="ListParagraph"/>
+        <w:numPr>
+          <w:ilvl w:val="0"/>
+          <w:numId w:val="2"/>
+        </w:numPr>
+        <w:spacing w:after="20" w:before="0"/>
+      </w:pPr>
+      <w:r>
+        <w:rPr>
+          <w:rFonts w:ascii="Times New Roman" w:cs="Times New Roman" w:eastAsia="Times New Roman" w:hAnsi="Times New Roman"/>
+          <w:sz w:val="22"/>
+          <w:szCs w:val="22"/>
+        </w:rPr>
+        <w:t xml:space="preserve">Law: tech contracts, GDPR, EU AI Act, tax, litigation, M&amp;A</w:t>
       </w:r>
     </w:p>
     <w:sectPr>

</xml_diff>

<commit_message>
CV: add PyTorch and CS50 for Lawyers, rename FDE to Legal Engineer, drop EFB placement line
Co-Authored-By: Claude Opus 5.5 <noreply@anthropic.com>
Claude-Session: https://claude.ai/code/session_01FkUVpnmeCRPZ4XVFEJqiKk
</commit_message>
<xml_diff>
--- a/cv/Arsene_Le_Moigne_CV_EN_Legal_Engineer.docx
+++ b/cv/Arsene_Le_Moigne_CV_EN_Legal_Engineer.docx
@@ -31,7 +31,7 @@
         </w:rPr>
         <w:t xml:space="preserve">Mobile: +420 702 080 468 | </w:t>
       </w:r>
-      <w:hyperlink w:history="1" r:id="rIdlnxuqguvlfqes9sg01o3p">
+      <w:hyperlink w:history="1" r:id="rId1t5aqbylcb11d8mdb5pby">
         <w:r>
           <w:rPr>
             <w:rFonts w:ascii="Times New Roman" w:cs="Times New Roman" w:eastAsia="Times New Roman" w:hAnsi="Times New Roman"/>
@@ -159,7 +159,7 @@
           <w:sz w:val="22"/>
           <w:szCs w:val="22"/>
         </w:rPr>
-        <w:t xml:space="preserve">Forward deployed engineer for a client: built and shipped AI agents for compliance, contract analysis, legal research, IP analysis and counterfeit tracking</w:t>
+        <w:t xml:space="preserve">Legal Engineer for a client: built and shipped AI agents for compliance, contract analysis, legal research, IP analysis and counterfeit tracking</w:t>
       </w:r>
     </w:p>
     <w:p>
@@ -572,7 +572,7 @@
           <w:sz w:val="22"/>
           <w:szCs w:val="22"/>
         </w:rPr>
-        <w:t xml:space="preserve">Passed the French bar exam (CRFPA, tax law) · Work placement at Delos Intelligence</w:t>
+        <w:t xml:space="preserve">Passed the French bar exam (CRFPA, tax law)</w:t>
       </w:r>
       <w:r>
         <w:rPr>
@@ -906,7 +906,25 @@
           <w:sz w:val="22"/>
           <w:szCs w:val="22"/>
         </w:rPr>
-        <w:t xml:space="preserve">Tech: Claude and OpenAI APIs, MCP, WhatsApp Business API, Python (Harvard CS50), SQL (Google Data Analytics), TypeScript, Next.js, Supabase</w:t>
+        <w:t xml:space="preserve">Tech: Python, PyTorch, SQL, TypeScript, Next.js, Supabase; Claude and OpenAI APIs, MCP, WhatsApp Business API</w:t>
+      </w:r>
+    </w:p>
+    <w:p>
+      <w:pPr>
+        <w:pStyle w:val="ListParagraph"/>
+        <w:numPr>
+          <w:ilvl w:val="0"/>
+          <w:numId w:val="2"/>
+        </w:numPr>
+        <w:spacing w:after="20" w:before="0"/>
+      </w:pPr>
+      <w:r>
+        <w:rPr>
+          <w:rFonts w:ascii="Times New Roman" w:cs="Times New Roman" w:eastAsia="Times New Roman" w:hAnsi="Times New Roman"/>
+          <w:sz w:val="22"/>
+          <w:szCs w:val="22"/>
+        </w:rPr>
+        <w:t xml:space="preserve">Certifications: Harvard CS50, Harvard CS50 for Lawyers, Google Data Analytics</w:t>
       </w:r>
     </w:p>
     <w:p>

</xml_diff>

<commit_message>
CV: reword Delos and LVMH bullets, drop Delta financial model and web stack
Co-Authored-By: Claude Opus 5.5 <noreply@anthropic.com>
Claude-Session: https://claude.ai/code/session_01FkUVpnmeCRPZ4XVFEJqiKk
</commit_message>
<xml_diff>
--- a/cv/Arsene_Le_Moigne_CV_EN_Legal_Engineer.docx
+++ b/cv/Arsene_Le_Moigne_CV_EN_Legal_Engineer.docx
@@ -31,7 +31,7 @@
         </w:rPr>
         <w:t xml:space="preserve">Mobile: +420 702 080 468 | </w:t>
       </w:r>
-      <w:hyperlink w:history="1" r:id="rId1t5aqbylcb11d8mdb5pby">
+      <w:hyperlink w:history="1" r:id="rIdywreunibuxdb2yosgxqae">
         <w:r>
           <w:rPr>
             <w:rFonts w:ascii="Times New Roman" w:cs="Times New Roman" w:eastAsia="Times New Roman" w:hAnsi="Times New Roman"/>
@@ -159,25 +159,25 @@
           <w:sz w:val="22"/>
           <w:szCs w:val="22"/>
         </w:rPr>
-        <w:t xml:space="preserve">Legal Engineer for a client: built and shipped AI agents for compliance, contract analysis, legal research, IP analysis and counterfeit tracking</w:t>
-      </w:r>
-    </w:p>
-    <w:p>
-      <w:pPr>
-        <w:pStyle w:val="ListParagraph"/>
-        <w:numPr>
-          <w:ilvl w:val="0"/>
-          <w:numId w:val="2"/>
-        </w:numPr>
-        <w:spacing w:after="20" w:before="0"/>
-      </w:pPr>
-      <w:r>
-        <w:rPr>
-          <w:rFonts w:ascii="Times New Roman" w:cs="Times New Roman" w:eastAsia="Times New Roman" w:hAnsi="Times New Roman"/>
-          <w:sz w:val="22"/>
-          <w:szCs w:val="22"/>
-        </w:rPr>
-        <w:t xml:space="preserve">Owned the agent's WhatsApp integration end to end (code, testing, evaluation, production release); it powered an ads campaign I co-designed</w:t>
+        <w:t xml:space="preserve">Shipped and customized AI agents for compliance, contract analysis, legal research, IP analysis and counterfeit-tracking use cases</w:t>
+      </w:r>
+    </w:p>
+    <w:p>
+      <w:pPr>
+        <w:pStyle w:val="ListParagraph"/>
+        <w:numPr>
+          <w:ilvl w:val="0"/>
+          <w:numId w:val="2"/>
+        </w:numPr>
+        <w:spacing w:after="20" w:before="0"/>
+      </w:pPr>
+      <w:r>
+        <w:rPr>
+          <w:rFonts w:ascii="Times New Roman" w:cs="Times New Roman" w:eastAsia="Times New Roman" w:hAnsi="Times New Roman"/>
+          <w:sz w:val="22"/>
+          <w:szCs w:val="22"/>
+        </w:rPr>
+        <w:t xml:space="preserve">Owned the agent's WhatsApp integration end to end (code, testing, evaluation, production release), which powered an ads campaign I co-designed</w:t>
       </w:r>
     </w:p>
     <w:p>
@@ -314,24 +314,6 @@
     </w:p>
     <w:p>
       <w:pPr>
-        <w:pStyle w:val="ListParagraph"/>
-        <w:numPr>
-          <w:ilvl w:val="0"/>
-          <w:numId w:val="2"/>
-        </w:numPr>
-        <w:spacing w:after="20" w:before="0"/>
-      </w:pPr>
-      <w:r>
-        <w:rPr>
-          <w:rFonts w:ascii="Times New Roman" w:cs="Times New Roman" w:eastAsia="Times New Roman" w:hAnsi="Times New Roman"/>
-          <w:sz w:val="22"/>
-          <w:szCs w:val="22"/>
-        </w:rPr>
-        <w:t xml:space="preserve">Built the full financial model for investor relations</w:t>
-      </w:r>
-    </w:p>
-    <w:p>
-      <w:pPr>
         <w:tabs>
           <w:tab w:val="right" w:pos="10466"/>
         </w:tabs>
@@ -405,7 +387,7 @@
           <w:sz w:val="22"/>
           <w:szCs w:val="22"/>
         </w:rPr>
-        <w:t xml:space="preserve">Mapped customs-risk exposure across 25+ brands with a Python tool I developed</w:t>
+        <w:t xml:space="preserve">Mapped customs-risk exposure across 25+ brands in Python, used by executives to anticipate the impact of the Trump tariffs</w:t>
       </w:r>
     </w:p>
     <w:p>
@@ -906,7 +888,7 @@
           <w:sz w:val="22"/>
           <w:szCs w:val="22"/>
         </w:rPr>
-        <w:t xml:space="preserve">Tech: Python, PyTorch, SQL, TypeScript, Next.js, Supabase; Claude and OpenAI APIs, MCP, WhatsApp Business API</w:t>
+        <w:t xml:space="preserve">Tech: Python, PyTorch, SQL, APIs, MCP</w:t>
       </w:r>
     </w:p>
     <w:p>

</xml_diff>

<commit_message>
CV: legal rewording for Pierstone with EU Digital Decade texts, CS50 Python
Co-Authored-By: Claude Opus 5.5 <noreply@anthropic.com>
Claude-Session: https://claude.ai/code/session_01FkUVpnmeCRPZ4XVFEJqiKk
</commit_message>
<xml_diff>
--- a/cv/Arsene_Le_Moigne_CV_EN_Legal_Engineer.docx
+++ b/cv/Arsene_Le_Moigne_CV_EN_Legal_Engineer.docx
@@ -31,7 +31,7 @@
         </w:rPr>
         <w:t xml:space="preserve">Mobile: +420 702 080 468 | </w:t>
       </w:r>
-      <w:hyperlink w:history="1" r:id="rIdywreunibuxdb2yosgxqae">
+      <w:hyperlink w:history="1" r:id="rIdjuwr8uobitxqbmb_qi7_o">
         <w:r>
           <w:rPr>
             <w:rFonts w:ascii="Times New Roman" w:cs="Times New Roman" w:eastAsia="Times New Roman" w:hAnsi="Times New Roman"/>
@@ -465,25 +465,43 @@
           <w:sz w:val="22"/>
           <w:szCs w:val="22"/>
         </w:rPr>
-        <w:t xml:space="preserve">Reviewed pre-contractual documentation and share purchase agreements</w:t>
-      </w:r>
-    </w:p>
-    <w:p>
-      <w:pPr>
-        <w:pStyle w:val="ListParagraph"/>
-        <w:numPr>
-          <w:ilvl w:val="0"/>
-          <w:numId w:val="2"/>
-        </w:numPr>
-        <w:spacing w:after="20" w:before="0"/>
-      </w:pPr>
-      <w:r>
-        <w:rPr>
-          <w:rFonts w:ascii="Times New Roman" w:cs="Times New Roman" w:eastAsia="Times New Roman" w:hAnsi="Times New Roman"/>
-          <w:sz w:val="22"/>
-          <w:szCs w:val="22"/>
-        </w:rPr>
-        <w:t xml:space="preserve">Led a due diligence in Hamburg on my own for an international litigation case</w:t>
+        <w:t xml:space="preserve">Analysed the EU Digital Decade regulatory framework: DSA, Data Act, DGA, DORA</w:t>
+      </w:r>
+    </w:p>
+    <w:p>
+      <w:pPr>
+        <w:pStyle w:val="ListParagraph"/>
+        <w:numPr>
+          <w:ilvl w:val="0"/>
+          <w:numId w:val="2"/>
+        </w:numPr>
+        <w:spacing w:after="20" w:before="0"/>
+      </w:pPr>
+      <w:r>
+        <w:rPr>
+          <w:rFonts w:ascii="Times New Roman" w:cs="Times New Roman" w:eastAsia="Times New Roman" w:hAnsi="Times New Roman"/>
+          <w:sz w:val="22"/>
+          <w:szCs w:val="22"/>
+        </w:rPr>
+        <w:t xml:space="preserve">Reviewed pre-contractual documentation and share purchase agreements in M&amp;A transactions</w:t>
+      </w:r>
+    </w:p>
+    <w:p>
+      <w:pPr>
+        <w:pStyle w:val="ListParagraph"/>
+        <w:numPr>
+          <w:ilvl w:val="0"/>
+          <w:numId w:val="2"/>
+        </w:numPr>
+        <w:spacing w:after="20" w:before="0"/>
+      </w:pPr>
+      <w:r>
+        <w:rPr>
+          <w:rFonts w:ascii="Times New Roman" w:cs="Times New Roman" w:eastAsia="Times New Roman" w:hAnsi="Times New Roman"/>
+          <w:sz w:val="22"/>
+          <w:szCs w:val="22"/>
+        </w:rPr>
+        <w:t xml:space="preserve">Conducted a due diligence in Hamburg independently, in support of international litigation</w:t>
       </w:r>
     </w:p>
     <w:p>
@@ -906,25 +924,25 @@
           <w:sz w:val="22"/>
           <w:szCs w:val="22"/>
         </w:rPr>
-        <w:t xml:space="preserve">Certifications: Harvard CS50, Harvard CS50 for Lawyers, Google Data Analytics</w:t>
-      </w:r>
-    </w:p>
-    <w:p>
-      <w:pPr>
-        <w:pStyle w:val="ListParagraph"/>
-        <w:numPr>
-          <w:ilvl w:val="0"/>
-          <w:numId w:val="2"/>
-        </w:numPr>
-        <w:spacing w:after="20" w:before="0"/>
-      </w:pPr>
-      <w:r>
-        <w:rPr>
-          <w:rFonts w:ascii="Times New Roman" w:cs="Times New Roman" w:eastAsia="Times New Roman" w:hAnsi="Times New Roman"/>
-          <w:sz w:val="22"/>
-          <w:szCs w:val="22"/>
-        </w:rPr>
-        <w:t xml:space="preserve">Law: tech contracts, GDPR, EU AI Act, tax, litigation, M&amp;A</w:t>
+        <w:t xml:space="preserve">Certifications: Harvard CS50 Python, Harvard CS50 for Lawyers, Google Data Analytics</w:t>
+      </w:r>
+    </w:p>
+    <w:p>
+      <w:pPr>
+        <w:pStyle w:val="ListParagraph"/>
+        <w:numPr>
+          <w:ilvl w:val="0"/>
+          <w:numId w:val="2"/>
+        </w:numPr>
+        <w:spacing w:after="20" w:before="0"/>
+      </w:pPr>
+      <w:r>
+        <w:rPr>
+          <w:rFonts w:ascii="Times New Roman" w:cs="Times New Roman" w:eastAsia="Times New Roman" w:hAnsi="Times New Roman"/>
+          <w:sz w:val="22"/>
+          <w:szCs w:val="22"/>
+        </w:rPr>
+        <w:t xml:space="preserve">Law: tech contracts, GDPR, EU AI Act, DSA, Data Act, DGA, DORA, tax, litigation, M&amp;A</w:t>
       </w:r>
     </w:p>
     <w:sectPr>

</xml_diff>

<commit_message>
CV: add thesis subtitle
Co-Authored-By: Claude Opus 5.5 <noreply@anthropic.com>
Claude-Session: https://claude.ai/code/session_01FkUVpnmeCRPZ4XVFEJqiKk
</commit_message>
<xml_diff>
--- a/cv/Arsene_Le_Moigne_CV_EN_Legal_Engineer.docx
+++ b/cv/Arsene_Le_Moigne_CV_EN_Legal_Engineer.docx
@@ -31,7 +31,7 @@
         </w:rPr>
         <w:t xml:space="preserve">Mobile: +420 702 080 468 | </w:t>
       </w:r>
-      <w:hyperlink w:history="1" r:id="rIdjuwr8uobitxqbmb_qi7_o">
+      <w:hyperlink w:history="1" r:id="rIdnmoamj2bq6-my8ermhlwb">
         <w:r>
           <w:rPr>
             <w:rFonts w:ascii="Times New Roman" w:cs="Times New Roman" w:eastAsia="Times New Roman" w:hAnsi="Times New Roman"/>
@@ -658,7 +658,7 @@
           <w:sz w:val="22"/>
           <w:szCs w:val="22"/>
         </w:rPr>
-        <w:t xml:space="preserve">Thesis: “The Commercial Lifecycle of Autonomous Agents”</w:t>
+        <w:t xml:space="preserve">Thesis: “The Commercial Lifecycle of Autonomous Agents: From Contracts to Tax”</w:t>
       </w:r>
     </w:p>
     <w:p>

</xml_diff>